<commit_message>
court(ncsuperct): opening, amicus, answering, motion and reply briefs gated on the shared model, latex and docx regenerated
The serial lane's URL breaks settle the opening, answering and amicus lines. INPUT
transcription fixes where the readers disagreed: a footnote mark set after a space
(amicus), straight quotes the readers paired differently and an apostrophe after
emphasis (reply, motion), a URL whose hyphens became dashes (motion), run-in a./b./c.
labels transcribed as headings (motion). The reply's counsel move from the cover to
after the signature, as filed (an email ran into the gutter at three columns); the
opening brief keeps its date line with the signature. Amicus docx reported: LibreOffice's
footnote placement (page 6).

(fb-595.54.49)

Co-Authored-By: Claude Opus 5.5 <noreply@anthropic.com>
</commit_message>
<xml_diff>
--- a/courts/fourth-circuit/north-carolina/state/superior-court/amicus-brief/usage/OUTPUT-amicus-brief.docx
+++ b/courts/fourth-circuit/north-carolina/state/superior-court/amicus-brief/usage/OUTPUT-amicus-brief.docx
@@ -2392,9 +2392,6 @@
         <w:t xml:space="preserve">Amici are (1) North Carolina voters who at the time of voting in the 2024 General Election met all the requirements under North Carolina law to register and vote, lawfully voted under the laws and regulations that existed during the voting process, and now face threat of disenfranchisement by the relief sought in Judge Griffin’s Election Protests, specifically voters challenged as lacking a Social Security Number (“SSN”) or driver’s license number in their voter registration (the “Incomplete Protests”) or not presenting voter ID when voting overseas (“Overseas ID Protests”) as a sole reason for disqualification (hereinafter the “Impacted Voters”)</w:t>
       </w:r>
       <w:r>
-        <w:t xml:space="preserve"> </w:t>
-      </w:r>
-      <w:r>
         <w:rPr>
           <w:rStyle w:val="FootnoteReference"/>
         </w:rPr>
@@ -2412,9 +2409,6 @@
         <w:t xml:space="preserve">As described in Exhibits 1 through 26, and summarized below, each of the Impacted Voters have an interest in the outcome of this matter both with regard to their challenged ballot in the 2024 General Election and their broader faith in North Carolina elections should their lawful vote be canceled due to no fault of their own. Judge Griffin’s protests also disproportionately impact the Black and brown constituents and members of the Organizational Amici, whose voting rights are under consistent attack in the state of North Carolina, which provides a unique and particularly strong interest in the case for those organizations.</w:t>
       </w:r>
       <w:r>
-        <w:t xml:space="preserve"> </w:t>
-      </w:r>
-      <w:r>
         <w:rPr>
           <w:rStyle w:val="FootnoteReference"/>
         </w:rPr>
@@ -2667,13 +2661,13 @@
         <w:pStyle w:val="BodyText"/>
       </w:pPr>
       <w:r>
-        <w:t xml:space="preserve">North Carolina Black Alliance (“NC Black Alliance”) is a nonpartisan 501(c)⁠(3) organization that addresses policy and economic issues to enhance Black communities by developing and promoting systemic policy change. To further its mission, NC Black Alliance works to mobilize the electorate through registration and education, including by eliminating barriers to voting participation. NC Black Alliance has also created a platform (located at https://safevoternc.org/) to provide voters with credible, up-to-date information regarding voting options and clear guidelines on how they can vote and avoid obstacles while voting at the polls. In direct response to the election protests, NC Black Alliance has created a resource at https://ncblackalliance.org/​countdontcancel/ to ensure the voice of the people is respected. In all of its efforts, NC Black Alliance works toward state-level systemic change through democratic engagement and collaboration with grassroots networks, and Petitioner’s request to remove 60,000 voters’ ballots from the count is detrimental to its efforts.</w:t>
-      </w:r>
-      <w:r>
-        <w:t xml:space="preserve"> </w:t>
-      </w:r>
-      <w:r>
-        <w:t xml:space="preserve">Common Cause Education Fund is a nonpartisan, 501(c)⁠(3) organization which, along with its sister organization, Common Cause, has over 1.5 million members nationwide and staff in 25 states, including North Carolina. Common Cause Education Fund’s mission centers on fair elections and encouraging a more representative, open, and responsive democracy. Common Cause Education Fund’s North Carolina office created a website about the election protests (https://www.commoncause.org/​north-carolina/​griffin/), which includes information to help voters see if their name is on the election protests list. It also hosted a town hall event, launched a statewide public service campaign to raise awareness about the election protests, issued press releases, and posted information to its social media. Additionally, a number of Common Cause Education Fund’s members and supporters are on the lists of voters challenged by Petitioner in these election protests. Common Cause Education Fund seeks to ensure those members’ votes are counted and their voices are heard. In the course of the organization’s work to reach voters challenged in the protest, Common Cause Education Fund’s North Carolina office and its partner organizations, including other amici organizations, prepared and verified a list of more than 1,000 voters who are speaking out against being challenged wrongfully in this election by Judge Griffin. See Ex. 27.</w:t>
+        <w:t xml:space="preserve">North Carolina Black Alliance (“NC Black Alliance”) is a nonpartisan 501(c)⁠(3) organization that addresses policy and economic issues to enhance Black communities by developing and promoting systemic policy change. To further its mission, NC Black Alliance works to mobilize the electorate through registration and education, including by eliminating barriers to voting participation. NC Black Alliance has also created a platform (located at https://​safevoternc.​org/​) to provide voters with credible, up-to-date information regarding voting options and clear guidelines on how they can vote and avoid obstacles while voting at the polls. In direct response to the election protests, NC Black Alliance has created a resource at https://​ncblackalliance.​org/​countdontcancel/ to ensure the voice of the people is respected. In all of its efforts, NC Black Alliance works toward state-level systemic change through democratic engagement and collaboration with grassroots networks, and Petitioner’s request to remove 60,000 voters’ ballots from the count is detrimental to its efforts.</w:t>
+      </w:r>
+      <w:r>
+        <w:t xml:space="preserve"> </w:t>
+      </w:r>
+      <w:r>
+        <w:t xml:space="preserve">Common Cause Education Fund is a nonpartisan, 501(c)⁠(3) organization which, along with its sister organization, Common Cause, has over 1.5 million members nationwide and staff in 25 states, including North Carolina. Common Cause Education Fund’s mission centers on fair elections and encouraging a more representative, open, and responsive democracy. Common Cause Education Fund’s North Carolina office created a website about the election protests (https://​www.​commoncause.​org/​north-​carolina/​griffin/​), which includes information to help voters see if their name is on the election protests list. It also hosted a town hall event, launched a statewide public service campaign to raise awareness about the election protests, issued press releases, and posted information to its social media. Additionally, a number of Common Cause Education Fund’s members and supporters are on the lists of voters challenged by Petitioner in these election protests. Common Cause Education Fund seeks to ensure those members’ votes are counted and their voices are heard. In the course of the organization’s work to reach voters challenged in the protest, Common Cause Education Fund’s North Carolina office and its partner organizations, including other amici organizations, prepared and verified a list of more than 1,000 voters who are speaking out against being challenged wrongfully in this election by Judge Griffin. See Ex. 27.</w:t>
       </w:r>
     </w:p>
     <w:p>
@@ -3044,45 +3038,80 @@
         <w:noBreakHyphen/>
       </w:r>
       <w:r>
-        <w:t xml:space="preserve">3 (N.C. Jan. 22, 2025) (citing N.C.G.S. § 163</w:t>
+        <w:t xml:space="preserve">3 (N.C. Jan. 22, 2025) (citing N.C.G.S. § 163-⁠182.14(b)) (hereinafter “Supreme Court Order”);</w:t>
+      </w:r>
+      <w:r>
+        <w:t xml:space="preserve"> </w:t>
+      </w:r>
+      <w:r>
+        <w:rPr>
+          <w:i/>
+          <w:iCs/>
+        </w:rPr>
+        <w:t xml:space="preserve">see also id.</w:t>
+      </w:r>
+      <w:r>
+        <w:t xml:space="preserve"> </w:t>
+      </w:r>
+      <w:r>
+        <w:t xml:space="preserve">at 10 (Newby, C.J., concurring) (Judge Griffin’s protests “need[] to follow the statutorily provided procedures.”);</w:t>
+      </w:r>
+      <w:r>
+        <w:t xml:space="preserve"> </w:t>
+      </w:r>
+      <w:r>
+        <w:rPr>
+          <w:i/>
+          <w:iCs/>
+        </w:rPr>
+        <w:t xml:space="preserve">id.</w:t>
+      </w:r>
+      <w:r>
+        <w:t xml:space="preserve"> </w:t>
+      </w:r>
+      <w:r>
+        <w:t xml:space="preserve">at 11 (Earls, J., dissenting) (agreeing that the protests must proceed in Wake County Superior Court). “The process was designed by the people’s representatives in the General Assembly as the lawful way to inquire into elections and is transparently set out in the General Statutes.”</w:t>
+      </w:r>
+      <w:r>
+        <w:t xml:space="preserve"> </w:t>
+      </w:r>
+      <w:r>
+        <w:rPr>
+          <w:i/>
+          <w:iCs/>
+        </w:rPr>
+        <w:t xml:space="preserve">Id.</w:t>
+      </w:r>
+      <w:r>
+        <w:t xml:space="preserve"> </w:t>
+      </w:r>
+      <w:r>
+        <w:t xml:space="preserve">at 6 (Newby, C.J., concurring) (citing the election protest statutory scheme at N.C.G.S. §§ 163-⁠182.9 to</w:t>
+      </w:r>
+      <w:r>
+        <w:t xml:space="preserve"> </w:t>
       </w:r>
       <w:r>
         <w:noBreakHyphen/>
       </w:r>
       <w:r>
-        <w:t xml:space="preserve">182.14(b)) (hereinafter “Supreme Court Order”);</w:t>
-      </w:r>
-      <w:r>
-        <w:t xml:space="preserve"> </w:t>
-      </w:r>
-      <w:r>
-        <w:rPr>
-          <w:i/>
-          <w:iCs/>
-        </w:rPr>
-        <w:t xml:space="preserve">see also id.</w:t>
-      </w:r>
-      <w:r>
-        <w:t xml:space="preserve"> </w:t>
-      </w:r>
-      <w:r>
-        <w:t xml:space="preserve">at 10 (Newby, C.J., concurring) (Judge Griffin’s protests “need[] to follow the statutorily provided procedures.”);</w:t>
-      </w:r>
-      <w:r>
-        <w:t xml:space="preserve"> </w:t>
-      </w:r>
-      <w:r>
-        <w:rPr>
-          <w:i/>
-          <w:iCs/>
-        </w:rPr>
-        <w:t xml:space="preserve">id.</w:t>
-      </w:r>
-      <w:r>
-        <w:t xml:space="preserve"> </w:t>
-      </w:r>
-      <w:r>
-        <w:t xml:space="preserve">at 11 (Earls, J., dissenting) (agreeing that the protests must proceed in Wake County Superior Court). “The process was designed by the people’s representatives in the General Assembly as the lawful way to inquire into elections and is transparently set out in the General Statutes.”</w:t>
+        <w:t xml:space="preserve">182.15).</w:t>
+      </w:r>
+    </w:p>
+    <w:p>
+      <w:pPr>
+        <w:pStyle w:val="BodyText"/>
+      </w:pPr>
+      <w:r>
+        <w:t xml:space="preserve">Importantly, the North Carolina Supreme Court’s instruction that these protests be considered in the ordinary course, as required by state law, confers an obligation to proceed under the proper statutory scheme. This requires more than simply returning to this Court. It also requires adherence to the specific burdens of proof required under the North Carolina election protest scheme, as well as substantive standards for considering and challenging voter eligibility mandated under our state’s election law by the North Carolina General Assembly. If those standards are not satisfied, an election protest cannot succeed.</w:t>
+      </w:r>
+    </w:p>
+    <w:p>
+      <w:pPr>
+        <w:pStyle w:val="BodyTextNote"/>
+      </w:pPr>
+      <w:r>
+        <w:t xml:space="preserve">An election protest may be granted only when there is “substantial evidence of any violation, irregularity, or misconduct sufficient to cast doubt on the results of the election.” N.C.G.S. § 163-⁠182.10(d)⁠(2). A successful election protest must demonstrate, by “substantial evidence[,]” that such an irregularity actually casts doubt on the results of the election.</w:t>
       </w:r>
       <w:r>
         <w:t xml:space="preserve"> </w:t>
@@ -3098,22 +3127,71 @@
         <w:t xml:space="preserve"> </w:t>
       </w:r>
       <w:r>
-        <w:t xml:space="preserve">at 6 (Newby, C.J., concurring) (citing the election protest statutory scheme at N.C.G.S. §§ 163</w:t>
+        <w:t xml:space="preserve">Election protests may challenge voter eligibility if “claims regarding the eligibility of certain voters” constitute “evidence that an outcome-determinative violation of election law, irregularity, or misconduct has occurred.”</w:t>
+      </w:r>
+      <w:r>
+        <w:t xml:space="preserve"> </w:t>
+      </w:r>
+      <w:r>
+        <w:rPr>
+          <w:i/>
+          <w:iCs/>
+        </w:rPr>
+        <w:t xml:space="preserve">In re Consideration of Certain Legal Questions Affecting the Authentication of the 2016 General Election</w:t>
+      </w:r>
+      <w:r>
+        <w:t xml:space="preserve">, at 1</w:t>
       </w:r>
       <w:r>
         <w:noBreakHyphen/>
       </w:r>
       <w:r>
-        <w:t xml:space="preserve">182.9 to</w:t>
-      </w:r>
-      <w:r>
-        <w:t xml:space="preserve"> </w:t>
-      </w:r>
-      <w:r>
-        <w:noBreakHyphen/>
-      </w:r>
-      <w:r>
-        <w:t xml:space="preserve">182.15).</w:t>
+        <w:t xml:space="preserve">2 (N.C. State Bd. of Elections Nov. 28, 2016);</w:t>
+      </w:r>
+      <w:r>
+        <w:t xml:space="preserve"> </w:t>
+      </w:r>
+      <w:r>
+        <w:rPr>
+          <w:i/>
+          <w:iCs/>
+        </w:rPr>
+        <w:t xml:space="preserve">see also Bouvier v. Porter</w:t>
+      </w:r>
+      <w:r>
+        <w:t xml:space="preserve">, 386 N.C. 1, 4, 900 S.E.2d 838, 843 (2024). The “substantial evidence” standard requires evidence “strong enough to establish to a reasonable person that the claimed irregularities occurred and that those irregularities swayed the election.” North Carolina State Board of Elections, Election Protest Procedures Guide, at 8 (last updated June 27, 2022);</w:t>
+      </w:r>
+      <w:r>
+        <w:rPr>
+          <w:rStyle w:val="FootnoteReference"/>
+        </w:rPr>
+        <w:footnoteReference w:id="12"/>
+      </w:r>
+      <w:r>
+        <w:t xml:space="preserve"> </w:t>
+      </w:r>
+      <w:r>
+        <w:rPr>
+          <w:i/>
+          <w:iCs/>
+        </w:rPr>
+        <w:t xml:space="preserve">see also Lackey v. N.C. Dep’t of Hum. Res.</w:t>
+      </w:r>
+      <w:r>
+        <w:t xml:space="preserve">, 306 N.C. 231, 238, 293 S.E.2d 171, 176 (1982);</w:t>
+      </w:r>
+      <w:r>
+        <w:t xml:space="preserve"> </w:t>
+      </w:r>
+      <w:r>
+        <w:rPr>
+          <w:i/>
+          <w:iCs/>
+        </w:rPr>
+        <w:t xml:space="preserve">Humble Oil &amp; Ref. Co. v. Bd. of Aldermen</w:t>
+      </w:r>
+      <w:r>
+        <w:t xml:space="preserve">, 284 N.C. 458, 470–71, 202 S.E.2d 129, 137 (1974).</w:t>
       </w:r>
     </w:p>
     <w:p>
@@ -3121,7 +3199,7 @@
         <w:pStyle w:val="BodyText"/>
       </w:pPr>
       <w:r>
-        <w:t xml:space="preserve">Importantly, the North Carolina Supreme Court’s instruction that these protests be considered in the ordinary course, as required by state law, confers an obligation to proceed under the proper statutory scheme. This requires more than simply returning to this Court. It also requires adherence to the specific burdens of proof required under the North Carolina election protest scheme, as well as substantive standards for considering and challenging voter eligibility mandated under our state’s election law by the North Carolina General Assembly. If those standards are not satisfied, an election protest cannot succeed.</w:t>
+        <w:t xml:space="preserve">But the mere fact of raising these voter challenges in the election protest context does not vitiate the statutory standards for voter challenges. Indeed, in order for a protester to show a “violation of the election law or other irregularity or misconduct,” as required by N.C.G.S. § 163-⁠182.10(d)⁠(2), they must articulate a theory that is consistent with the whole of the election code. And when a voter (or over 60,000 voters) has their eligibility to cast a ballot challenged, state law governs how such a challenge must proceed and to what standard of proof it must be held. Those statutory standards apply with just as much force here.</w:t>
       </w:r>
     </w:p>
     <w:p>
@@ -3129,127 +3207,7 @@
         <w:pStyle w:val="BodyTextNote"/>
       </w:pPr>
       <w:r>
-        <w:t xml:space="preserve">An election protest may be granted only when there is “substantial evidence of any violation, irregularity, or misconduct sufficient to cast doubt on the results of the election.” N.C.G.S. § 163</w:t>
-      </w:r>
-      <w:r>
-        <w:noBreakHyphen/>
-      </w:r>
-      <w:r>
-        <w:t xml:space="preserve">182.10(d)⁠(2). A successful election protest must demonstrate, by “substantial evidence[,]” that such an irregularity actually casts doubt on the results of the election.</w:t>
-      </w:r>
-      <w:r>
-        <w:t xml:space="preserve"> </w:t>
-      </w:r>
-      <w:r>
-        <w:rPr>
-          <w:i/>
-          <w:iCs/>
-        </w:rPr>
-        <w:t xml:space="preserve">Id.</w:t>
-      </w:r>
-      <w:r>
-        <w:t xml:space="preserve"> </w:t>
-      </w:r>
-      <w:r>
-        <w:t xml:space="preserve">Election protests may challenge voter eligibility if “claims regarding the eligibility of certain voters” constitute “evidence that an outcome-determinative violation of election law, irregularity, or misconduct has occurred.”</w:t>
-      </w:r>
-      <w:r>
-        <w:t xml:space="preserve"> </w:t>
-      </w:r>
-      <w:r>
-        <w:rPr>
-          <w:i/>
-          <w:iCs/>
-        </w:rPr>
-        <w:t xml:space="preserve">In re Consideration of Certain Legal Questions Affecting the Authentication of the 2016 General Election</w:t>
-      </w:r>
-      <w:r>
-        <w:t xml:space="preserve">, at 1</w:t>
-      </w:r>
-      <w:r>
-        <w:noBreakHyphen/>
-      </w:r>
-      <w:r>
-        <w:t xml:space="preserve">2 (N.C. State Bd. of Elections Nov. 28, 2016);</w:t>
-      </w:r>
-      <w:r>
-        <w:t xml:space="preserve"> </w:t>
-      </w:r>
-      <w:r>
-        <w:rPr>
-          <w:i/>
-          <w:iCs/>
-        </w:rPr>
-        <w:t xml:space="preserve">see also Bouvier v. Porter</w:t>
-      </w:r>
-      <w:r>
-        <w:t xml:space="preserve">, 386 N.C. 1, 4, 900 S.E.2d 838, 843 (2024). The “substantial evidence” standard requires evidence “strong enough to establish to a reasonable person that the claimed irregularities occurred and that those irregularities swayed the election.” North Carolina State Board of Elections, Election Protest Procedures Guide, at 8 (last updated June 27, 2022);</w:t>
-      </w:r>
-      <w:r>
-        <w:rPr>
-          <w:rStyle w:val="FootnoteReference"/>
-        </w:rPr>
-        <w:footnoteReference w:id="12"/>
-      </w:r>
-      <w:r>
-        <w:t xml:space="preserve"> </w:t>
-      </w:r>
-      <w:r>
-        <w:rPr>
-          <w:i/>
-          <w:iCs/>
-        </w:rPr>
-        <w:t xml:space="preserve">see also Lackey v. N.C. Dep’t of Hum. Res.</w:t>
-      </w:r>
-      <w:r>
-        <w:t xml:space="preserve">, 306 N.C. 231, 238, 293 S.E.2d 171, 176 (1982);</w:t>
-      </w:r>
-      <w:r>
-        <w:t xml:space="preserve"> </w:t>
-      </w:r>
-      <w:r>
-        <w:rPr>
-          <w:i/>
-          <w:iCs/>
-        </w:rPr>
-        <w:t xml:space="preserve">Humble Oil &amp; Ref. Co. v. Bd. of Aldermen</w:t>
-      </w:r>
-      <w:r>
-        <w:t xml:space="preserve">, 284 N.C. 458, 470–71, 202 S.E.2d 129, 137 (1974).</w:t>
-      </w:r>
-    </w:p>
-    <w:p>
-      <w:pPr>
-        <w:pStyle w:val="BodyText"/>
-      </w:pPr>
-      <w:r>
-        <w:t xml:space="preserve">But the mere fact of raising these voter challenges in the election protest context does not vitiate the statutory standards for voter challenges. Indeed, in order for a protester to show a “violation of the election law or other irregularity or misconduct,” as required by N.C.G.S. § 163</w:t>
-      </w:r>
-      <w:r>
-        <w:noBreakHyphen/>
-      </w:r>
-      <w:r>
-        <w:t xml:space="preserve">182.10(d)⁠(2), they must articulate a theory that is consistent with the whole of the election code. And when a voter (or over 60,000 voters) has their eligibility to cast a ballot challenged, state law governs how such a challenge must proceed and to what standard of proof it must be held. Those statutory standards apply with just as much force here.</w:t>
-      </w:r>
-    </w:p>
-    <w:p>
-      <w:pPr>
-        <w:pStyle w:val="BodyTextNote"/>
-      </w:pPr>
-      <w:r>
-        <w:t xml:space="preserve">North Carolina election law has an unambiguous presumption of eligibility for a voter whose eligibility to vote is challenged. “No challenge shall be sustained unless the challenge is substantiated by affirmative proof. In the absence of such proof, the presumption shall be that the voter is properly registered or affiliated.” N.C.G.S. § 163</w:t>
-      </w:r>
-      <w:r>
-        <w:noBreakHyphen/>
-      </w:r>
-      <w:r>
-        <w:t xml:space="preserve">90.1(b). The statutory scheme also circumscribes when protesters may contest the eligibility of a voter. “Challenges shall not be made indiscriminately and may only be made if the challenger knows, suspects or reasonably believes such a person not to be qualified and entitled to vote.” N.C.G.S. § 163</w:t>
-      </w:r>
-      <w:r>
-        <w:noBreakHyphen/>
-      </w:r>
-      <w:r>
-        <w:t xml:space="preserve">90.1(a). In order to prevent indiscriminate challenges, the proffered evidence must be specific to the individual voter being challenged.</w:t>
+        <w:t xml:space="preserve">North Carolina election law has an unambiguous presumption of eligibility for a voter whose eligibility to vote is challenged. “No challenge shall be sustained unless the challenge is substantiated by affirmative proof. In the absence of such proof, the presumption shall be that the voter is properly registered or affiliated.” N.C.G.S. § 163-⁠90.1(b). The statutory scheme also circumscribes when protesters may contest the eligibility of a voter. “Challenges shall not be made indiscriminately and may only be made if the challenger knows, suspects or reasonably believes such a person not to be qualified and entitled to vote.” N.C.G.S. § 163-⁠90.1(a). In order to prevent indiscriminate challenges, the proffered evidence must be specific to the individual voter being challenged.</w:t>
       </w:r>
       <w:r>
         <w:t xml:space="preserve"> </w:t>
@@ -4007,13 +3965,109 @@
         <w:pStyle w:val="BodyText"/>
       </w:pPr>
       <w:r>
-        <w:t xml:space="preserve">Judge Griffin does not provide (or even allege the existence of) any evidence, let alone substantial evidence, in support of his sweeping claims. Protesters do not allege that even a single voter whose registration allegedly lacks a driver’s license or Social Security number is actually ineligible to vote under state law. Nor does Judge Griffin offer any investigation into the specific circumstances of any voter he identifies as potentially ineligible. As a result of these omissions, he fails to offer any evidence whatsoever that any of the voters challenged is in fact ineligible. What’s more, he does not dispute that each challenged voter was successfully able to cast a ballot in the General Election pursuant to a registration appearing on the state’s official list of valid registrants at the time of the election. “In the absence of such proof, the presumption shall be that the voter is properly registered or affiliated.” N.C.G.S. § 163</w:t>
+        <w:t xml:space="preserve">Judge Griffin does not provide (or even allege the existence of) any evidence, let alone substantial evidence, in support of his sweeping claims. Protesters do not allege that even a single voter whose registration allegedly lacks a driver’s license or Social Security number is actually ineligible to vote under state law. Nor does Judge Griffin offer any investigation into the specific circumstances of any voter he identifies as potentially ineligible. As a result of these omissions, he fails to offer any evidence whatsoever that any of the voters challenged is in fact ineligible. What’s more, he does not dispute that each challenged voter was successfully able to cast a ballot in the General Election pursuant to a registration appearing on the state’s official list of valid registrants at the time of the election. “In the absence of such proof, the presumption shall be that the voter is properly registered or affiliated.” N.C.G.S. § 163-⁠90.1(b). This lack of individualized allegations or evidence alone is sufficient to immediately dismiss Judge Griffin’s protest.</w:t>
+      </w:r>
+    </w:p>
+    <w:p>
+      <w:pPr>
+        <w:pStyle w:val="BodyText"/>
+      </w:pPr>
+      <w:r>
+        <w:t xml:space="preserve">Instead, the lists of voters whose registrations are purportedly incomplete as submitted by Judge Griffin with his protests rely upon precisely the kind of systematized data query that the Board has specifically said does not meet a challenger’s (or protester’s) burden to challenge voter ineligibility.</w:t>
+      </w:r>
+      <w:r>
+        <w:t xml:space="preserve"> </w:t>
+      </w:r>
+      <w:r>
+        <w:rPr>
+          <w:i/>
+          <w:iCs/>
+        </w:rPr>
+        <w:t xml:space="preserve">See</w:t>
+      </w:r>
+      <w:r>
+        <w:t xml:space="preserve"> </w:t>
+      </w:r>
+      <w:r>
+        <w:t xml:space="preserve">Voter Challenge Procedures Guide at 6. This kind of baseless mass challenge is exactly the circumstance that the North Carolina election code is designed to prevent.</w:t>
+      </w:r>
+    </w:p>
+    <w:p>
+      <w:pPr>
+        <w:pStyle w:val="BodyText"/>
+      </w:pPr>
+      <w:r>
+        <w:t xml:space="preserve">Furthermore, this failure to proffer any allegations, let alone affirmative proof, of actual ineligibility is expressly barred by the burden of proof codified in state statute. Challenges “may only be made if the challenger knows, suspects or reasonably believes such a person not to be qualified and entitled to vote.” N.C.G.S. § 163-⁠90.1(a). This affirmative requirement serves a state interest of fundamental importance: ensuring that when North Carolina voters participate in the democratic process and exercise their fundamental right to vote, those voters are not wantonly disenfranchised without definitive proof they were ineligible to vote.</w:t>
+      </w:r>
+    </w:p>
+    <w:p>
+      <w:pPr>
+        <w:pStyle w:val="BodyText"/>
+      </w:pPr>
+      <w:r>
+        <w:t xml:space="preserve">Judge Griffin also fails to account for the readily available alternative explanations that do not bear on voter eligibility for both the voters who appear in his “Incomplete Registration” protests and in his “Overseas ID” protests. Instead of arguing that these voters are substantively ineligible to vote in North Carolina, as required by N.C.G.S. § 163-⁠90.1, Griffin instead focuses on purported technical defects that do not bear on those voters’ actual eligibility. These efforts should fail because there are numerous possible explanations for these supposed omissions that do not show any voter’s actual ineligibility, even under Judge Griffin’s flawed theories of state law.</w:t>
+      </w:r>
+    </w:p>
+    <w:p>
+      <w:pPr>
+        <w:pStyle w:val="BodyText"/>
+      </w:pPr>
+      <w:r>
+        <w:t xml:space="preserve">Starting with the Incomplete protests, there are a multitude of reasons why an eligible voter’s file might be missing a driver’s license or Social Security number. For example, voters may have provided a driver’s license or Social Security number at the time of registration, and it was either not entered into or was somehow removed from their voter registration file.</w:t>
+      </w:r>
+      <w:r>
+        <w:t xml:space="preserve"> </w:t>
+      </w:r>
+      <w:r>
+        <w:rPr>
+          <w:i/>
+          <w:iCs/>
+        </w:rPr>
+        <w:t xml:space="preserve">See, e.g.</w:t>
+      </w:r>
+      <w:r>
+        <w:t xml:space="preserve">, Exs. 2, 6–15, 17, 19–22, 25 (Impacted Voters who remember providing identifying information, including some who confirmed this with their county board of elections). This includes voters who might have provided a driver’s license or Social Security number at the time of registration, but had their information mismatch to the DMV database or Social Security Administration databases for reasons unrelated to eligibility (such as inadvertent typos in information, misspelling or reasonable variation in names) and thus omitted in the voter file, a possibility the State Board has expressly recognized.</w:t>
+      </w:r>
+      <w:r>
+        <w:t xml:space="preserve"> </w:t>
+      </w:r>
+      <w:r>
+        <w:rPr>
+          <w:i/>
+          <w:iCs/>
+        </w:rPr>
+        <w:t xml:space="preserve">See</w:t>
+      </w:r>
+      <w:r>
+        <w:t xml:space="preserve"> </w:t>
+      </w:r>
+      <w:r>
+        <w:t xml:space="preserve">NCSBE Decision and Order at 16 (Dec. 13, 2024) (“[W]hen a registrant provides one of these numbers but the number does not validate through a database match among different government databases, their voter registration database record will lack such a number.”) These and other voters may also have provided a driver’s license or Social Security number at a later date, such as when they requested a mail-in ballot or when they presented a driver’s license to satisfy North Carolina’ voter ID requirement.</w:t>
+      </w:r>
+      <w:r>
+        <w:t xml:space="preserve"> </w:t>
+      </w:r>
+      <w:r>
+        <w:rPr>
+          <w:i/>
+          <w:iCs/>
+        </w:rPr>
+        <w:t xml:space="preserve">See, e.g.</w:t>
+      </w:r>
+      <w:r>
+        <w:t xml:space="preserve">, Ex. 1</w:t>
       </w:r>
       <w:r>
         <w:noBreakHyphen/>
       </w:r>
       <w:r>
-        <w:t xml:space="preserve">90.1(b). This lack of individualized allegations or evidence alone is sufficient to immediately dismiss Judge Griffin’s protest.</w:t>
+        <w:t xml:space="preserve">3, 6, 8, 10</w:t>
+      </w:r>
+      <w:r>
+        <w:noBreakHyphen/>
+      </w:r>
+      <w:r>
+        <w:t xml:space="preserve">22, 24, 25 (Impacted Voters who provided their driver’s license when they voted). Moreover, other voters also might not possess a driver’s license or Social Security number but still be a North Carolina citizen who is eligible to register and vote, a scenario that is contemplated by both state and federal law. In other words, even if Judge Griffin’s erroneous view of state and federal law as to alleged “Incomplete” voters were true (it is not), his failure to include specific allegations as to specific voters’ eligibility is fatal to his protests.</w:t>
       </w:r>
     </w:p>
     <w:p>
@@ -4021,23 +4075,7 @@
         <w:pStyle w:val="BodyText"/>
       </w:pPr>
       <w:r>
-        <w:t xml:space="preserve">Instead, the lists of voters whose registrations are purportedly incomplete as submitted by Judge Griffin with his protests rely upon precisely the kind of systematized data query that the Board has specifically said does not meet a challenger’s (or protester’s) burden to challenge voter ineligibility.</w:t>
-      </w:r>
-      <w:r>
-        <w:t xml:space="preserve"> </w:t>
-      </w:r>
-      <w:r>
-        <w:rPr>
-          <w:i/>
-          <w:iCs/>
-        </w:rPr>
-        <w:t xml:space="preserve">See</w:t>
-      </w:r>
-      <w:r>
-        <w:t xml:space="preserve"> </w:t>
-      </w:r>
-      <w:r>
-        <w:t xml:space="preserve">Voter Challenge Procedures Guide at 6. This kind of baseless mass challenge is exactly the circumstance that the North Carolina election code is designed to prevent.</w:t>
+        <w:t xml:space="preserve">At base, whether any one of these reasons, or yet another reason, specifically describes any individual voter’s circumstance is beside the point. It is the protester’s burden under state law to affirmatively show that the voters they claim are ineligible are, in fact, ineligible to vote. Yet Judge Griffin has done nothing to rebut or disprove the presumption of eligibility, much less account for the many plausible alternative explanations for the inclusion of any of the voters he challenges on the “incomplete registration” list, let alone establish actual ineligibility for any of these voters.</w:t>
       </w:r>
     </w:p>
     <w:p>
@@ -4045,104 +4083,6 @@
         <w:pStyle w:val="BodyText"/>
       </w:pPr>
       <w:r>
-        <w:t xml:space="preserve">Furthermore, this failure to proffer any allegations, let alone affirmative proof, of actual ineligibility is expressly barred by the burden of proof codified in state statute. Challenges “may only be made if the challenger knows, suspects or reasonably believes such a person not to be qualified and entitled to vote.” N.C.G.S. § 163</w:t>
-      </w:r>
-      <w:r>
-        <w:noBreakHyphen/>
-      </w:r>
-      <w:r>
-        <w:t xml:space="preserve">90.1(a). This affirmative requirement serves a state interest of fundamental importance: ensuring that when North Carolina voters participate in the democratic process and exercise their fundamental right to vote, those voters are not wantonly disenfranchised without definitive proof they were ineligible to vote.</w:t>
-      </w:r>
-    </w:p>
-    <w:p>
-      <w:pPr>
-        <w:pStyle w:val="BodyText"/>
-      </w:pPr>
-      <w:r>
-        <w:t xml:space="preserve">Judge Griffin also fails to account for the readily available alternative explanations that do not bear on voter eligibility for both the voters who appear in his “Incomplete Registration” protests and in his “Overseas ID” protests. Instead of arguing that these voters are substantively ineligible to vote in North Carolina, as required by N.C.G.S. § 163</w:t>
-      </w:r>
-      <w:r>
-        <w:noBreakHyphen/>
-      </w:r>
-      <w:r>
-        <w:t xml:space="preserve">90.1, Griffin instead focuses on purported technical defects that do not bear on those voters’ actual eligibility. These efforts should fail because there are numerous possible explanations for these supposed omissions that do not show any voter’s actual ineligibility, even under Judge Griffin’s flawed theories of state law.</w:t>
-      </w:r>
-    </w:p>
-    <w:p>
-      <w:pPr>
-        <w:pStyle w:val="BodyText"/>
-      </w:pPr>
-      <w:r>
-        <w:t xml:space="preserve">Starting with the Incomplete protests, there are a multitude of reasons why an eligible voter’s file might be missing a driver’s license or Social Security number. For example, voters may have provided a driver’s license or Social Security number at the time of registration, and it was either not entered into or was somehow removed from their voter registration file.</w:t>
-      </w:r>
-      <w:r>
-        <w:t xml:space="preserve"> </w:t>
-      </w:r>
-      <w:r>
-        <w:rPr>
-          <w:i/>
-          <w:iCs/>
-        </w:rPr>
-        <w:t xml:space="preserve">See, e.g.</w:t>
-      </w:r>
-      <w:r>
-        <w:t xml:space="preserve">, Exs. 2, 6–15, 17, 19–22, 25 (Impacted Voters who remember providing identifying information, including some who confirmed this with their county board of elections). This includes voters who might have provided a driver’s license or Social Security number at the time of registration, but had their information mismatch to the DMV database or Social Security Administration databases for reasons unrelated to eligibility (such as inadvertent typos in information, misspelling or reasonable variation in names) and thus omitted in the voter file, a possibility the State Board has expressly recognized.</w:t>
-      </w:r>
-      <w:r>
-        <w:t xml:space="preserve"> </w:t>
-      </w:r>
-      <w:r>
-        <w:rPr>
-          <w:i/>
-          <w:iCs/>
-        </w:rPr>
-        <w:t xml:space="preserve">See</w:t>
-      </w:r>
-      <w:r>
-        <w:t xml:space="preserve"> </w:t>
-      </w:r>
-      <w:r>
-        <w:t xml:space="preserve">NCSBE Decision and Order at 16 (Dec. 13, 2024) (“[W]hen a registrant provides one of these numbers but the number does not validate through a database match among different government databases, their voter registration database record will lack such a number.”) These and other voters may also have provided a driver’s license or Social Security number at a later date, such as when they requested a mail-in ballot or when they presented a driver’s license to satisfy North Carolina’ voter ID requirement.</w:t>
-      </w:r>
-      <w:r>
-        <w:t xml:space="preserve"> </w:t>
-      </w:r>
-      <w:r>
-        <w:rPr>
-          <w:i/>
-          <w:iCs/>
-        </w:rPr>
-        <w:t xml:space="preserve">See, e.g.</w:t>
-      </w:r>
-      <w:r>
-        <w:t xml:space="preserve">, Ex. 1</w:t>
-      </w:r>
-      <w:r>
-        <w:noBreakHyphen/>
-      </w:r>
-      <w:r>
-        <w:t xml:space="preserve">3, 6, 8, 10</w:t>
-      </w:r>
-      <w:r>
-        <w:noBreakHyphen/>
-      </w:r>
-      <w:r>
-        <w:t xml:space="preserve">22, 24, 25 (Impacted Voters who provided their driver’s license when they voted). Moreover, other voters also might not possess a driver’s license or Social Security number but still be a North Carolina citizen who is eligible to register and vote, a scenario that is contemplated by both state and federal law. In other words, even if Judge Griffin’s erroneous view of state and federal law as to alleged “Incomplete” voters were true (it is not), his failure to include specific allegations as to specific voters’ eligibility is fatal to his protests.</w:t>
-      </w:r>
-    </w:p>
-    <w:p>
-      <w:pPr>
-        <w:pStyle w:val="BodyText"/>
-      </w:pPr>
-      <w:r>
-        <w:t xml:space="preserve">At base, whether any one of these reasons, or yet another reason, specifically describes any individual voter’s circumstance is beside the point. It is the protester’s burden under state law to affirmatively show that the voters they claim are ineligible are, in fact, ineligible to vote. Yet Judge Griffin has done nothing to rebut or disprove the presumption of eligibility, much less account for the many plausible alternative explanations for the inclusion of any of the voters he challenges on the “incomplete registration” list, let alone establish actual ineligibility for any of these voters.</w:t>
-      </w:r>
-    </w:p>
-    <w:p>
-      <w:pPr>
-        <w:pStyle w:val="BodyText"/>
-      </w:pPr>
-      <w:r>
         <w:t xml:space="preserve">In short, Judge Griffin’s protests elide any examination of what actually happened in the case of these voters, preferring instead to seize on technicalities and hypotheticals to merely insinuate ineligibility in conclusory terms. When combined with the presumption of eligibility and the failure of Griffin to even contemplate, much less rebut, these explanations, his protests fail as a matter of state law.</w:t>
       </w:r>
     </w:p>
@@ -4152,9 +4092,6 @@
       </w:pPr>
       <w:r>
         <w:t xml:space="preserve">Griffin’s Overseas ID protests omit an even more obvious explanation for the purported violation of election law: Each and every voter included on this list did not include a copy of their identification documents with their absentee ballot because the State Board expressly told them, with approval by the Rules Regulatory Commission, there was no need to do so under state law.</w:t>
-      </w:r>
-      <w:r>
-        <w:t xml:space="preserve"> </w:t>
       </w:r>
       <w:r>
         <w:rPr>
@@ -4514,16 +4451,7 @@
         <w:pStyle w:val="BodyTextNote"/>
       </w:pPr>
       <w:r>
-        <w:t xml:space="preserve">Even were the Court to assume that Judge Griffin had shown a practice administered by the State Board of Elections during the 2024 General Election that was an irregularity or violation of law, which he has not, he still has not satisfied his burden of demonstrating that any such alleged irregularity was outcome-determinative. This is because he cannot show that, had his preferred interpretation of the law been in place all along, any of the challenged voters could not have satisfied these requirements and still cast a ballot. For example, he cannot show that had the “correct” voter registration form been utilized for voters, that they did not already, or that they could not have completed and satisfied the requirements of state law if given the opportunity. (As the appended affidavits show, many in fact did.) Likewise, he has not alleged that if any of the challenged overseas voters who followed all requirements set forth for the 2024 election had, in fact, been required to satisfy the photo voter ID requirement or been provided the option of a reasonable impediment exception form that they could not have complied. As for purported “non-resident” voters, who voted based on a state law explicitly granting them that right, N.C.G.S. § 163</w:t>
-      </w:r>
-      <w:r>
-        <w:noBreakHyphen/>
-      </w:r>
-      <w:r>
-        <w:t xml:space="preserve">258.2(1)⁠(e), those voters number fewer than 300, far below the margin of victory here, and thus would not be outcome determinative alone.</w:t>
-      </w:r>
-      <w:r>
-        <w:t xml:space="preserve"> </w:t>
+        <w:t xml:space="preserve">Even were the Court to assume that Judge Griffin had shown a practice administered by the State Board of Elections during the 2024 General Election that was an irregularity or violation of law, which he has not, he still has not satisfied his burden of demonstrating that any such alleged irregularity was outcome-determinative. This is because he cannot show that, had his preferred interpretation of the law been in place all along, any of the challenged voters could not have satisfied these requirements and still cast a ballot. For example, he cannot show that had the “correct” voter registration form been utilized for voters, that they did not already, or that they could not have completed and satisfied the requirements of state law if given the opportunity. (As the appended affidavits show, many in fact did.) Likewise, he has not alleged that if any of the challenged overseas voters who followed all requirements set forth for the 2024 election had, in fact, been required to satisfy the photo voter ID requirement or been provided the option of a reasonable impediment exception form that they could not have complied. As for purported “non-resident” voters, who voted based on a state law explicitly granting them that right, N.C.G.S. § 163-⁠258.2(1)⁠(e), those voters number fewer than 300, far below the margin of victory here, and thus would not be outcome determinative alone.</w:t>
       </w:r>
       <w:r>
         <w:rPr>
@@ -4903,254 +4831,236 @@
         <w:pStyle w:val="BodyText"/>
       </w:pPr>
       <w:r>
-        <w:t xml:space="preserve">On this point, North Carolina’s election protest statutes are again clear. Pursuant to N.C.G.S. § 163</w:t>
+        <w:t xml:space="preserve">On this point, North Carolina’s election protest statutes are again clear. Pursuant to N.C.G.S. § 163-⁠182.12, the State Board of Elections took jurisdiction over the protests at issue here.</w:t>
+      </w:r>
+      <w:r>
+        <w:t xml:space="preserve"> </w:t>
+      </w:r>
+      <w:r>
+        <w:rPr>
+          <w:i/>
+          <w:iCs/>
+        </w:rPr>
+        <w:t xml:space="preserve">See</w:t>
+      </w:r>
+      <w:r>
+        <w:t xml:space="preserve"> </w:t>
+      </w:r>
+      <w:r>
+        <w:t xml:space="preserve">NCSBE Decision and Order on Protests at 4. When the State Board of Elections takes jurisdiction of a protest, it follows the normal protest procedures laid out in N.C.G.S. § 163-⁠182.10. More importantly, the burden of proof to establish “substantial evidence of any violation, irregularity, or misconduct sufficient to cast doubt on the results of the election” remains in place, as it must for all election protests.</w:t>
+      </w:r>
+      <w:r>
+        <w:t xml:space="preserve"> </w:t>
+      </w:r>
+      <w:r>
+        <w:rPr>
+          <w:i/>
+          <w:iCs/>
+        </w:rPr>
+        <w:t xml:space="preserve">See</w:t>
+      </w:r>
+      <w:r>
+        <w:t xml:space="preserve"> </w:t>
+      </w:r>
+      <w:r>
+        <w:t xml:space="preserve">N.C.G.S. § 163-⁠182.10(d)⁠(2). Without such evidence, it is impossible for a protest to succeed.</w:t>
+      </w:r>
+      <w:r>
+        <w:t xml:space="preserve"> </w:t>
+      </w:r>
+      <w:r>
+        <w:rPr>
+          <w:i/>
+          <w:iCs/>
+        </w:rPr>
+        <w:t xml:space="preserve">Id.</w:t>
+      </w:r>
+    </w:p>
+    <w:p>
+      <w:pPr>
+        <w:pStyle w:val="BodyText"/>
+      </w:pPr>
+      <w:r>
+        <w:t xml:space="preserve">Griffin has no such evidence. Not only do his protests not contain any evidence, let alone substantial evidence, he has neglected to account for or rebut the plausible alternative explanations for the purported technical defects he identifies. And even more fundamentally, he has failed to show that any of the voters he challenges are actually ineligible to vote in North Carolina. These are all allegations that, even if they were sufficient to articulate a valid protest theory, must be tested through evidence, especially where the voters have followed the law and alternative and innocent explanations exist. The lack of evidentiary record in this case necessarily prevents Judge Griffin’s protests from establishing anything by substantial evidence, let alone a violation of state election law. There is no evidentiary basis to prove anything with here.</w:t>
+      </w:r>
+    </w:p>
+    <w:p>
+      <w:pPr>
+        <w:pStyle w:val="BodyText"/>
+      </w:pPr>
+      <w:r>
+        <w:rPr>
+          <w:i/>
+          <w:iCs/>
+        </w:rPr>
+        <w:t xml:space="preserve">James v. Bartlett</w:t>
+      </w:r>
+      <w:r>
+        <w:t xml:space="preserve">, 359 N.C. 260 (2005) does not counsel any differently. In</w:t>
+      </w:r>
+      <w:r>
+        <w:t xml:space="preserve"> </w:t>
+      </w:r>
+      <w:r>
+        <w:rPr>
+          <w:i/>
+          <w:iCs/>
+        </w:rPr>
+        <w:t xml:space="preserve">James</w:t>
+      </w:r>
+      <w:r>
+        <w:t xml:space="preserve">, the North Carolina Supreme Court ruled that when the State Board counted out-of-precinct provisional ballots, it was an outcome-determinative violation of state election law. 359 N.C. at 270. However, the evidentiary record in</w:t>
+      </w:r>
+      <w:r>
+        <w:t xml:space="preserve"> </w:t>
+      </w:r>
+      <w:r>
+        <w:rPr>
+          <w:i/>
+          <w:iCs/>
+        </w:rPr>
+        <w:t xml:space="preserve">James</w:t>
+      </w:r>
+      <w:r>
+        <w:t xml:space="preserve"> </w:t>
+      </w:r>
+      <w:r>
+        <w:t xml:space="preserve">was clear: there was no factual dispute that the challenged voters voted out-of-precinct.</w:t>
+      </w:r>
+      <w:r>
+        <w:t xml:space="preserve"> </w:t>
+      </w:r>
+      <w:r>
+        <w:rPr>
+          <w:i/>
+          <w:iCs/>
+        </w:rPr>
+        <w:t xml:space="preserve">Id.</w:t>
+      </w:r>
+      <w:r>
+        <w:t xml:space="preserve"> </w:t>
+      </w:r>
+      <w:r>
+        <w:t xml:space="preserve">at 263. Instead, the case turned entirely on whether voting out of precinct was legal under state law.</w:t>
+      </w:r>
+      <w:r>
+        <w:t xml:space="preserve"> </w:t>
+      </w:r>
+      <w:r>
+        <w:rPr>
+          <w:i/>
+          <w:iCs/>
+        </w:rPr>
+        <w:t xml:space="preserve">Id.</w:t>
+      </w:r>
+      <w:r>
+        <w:t xml:space="preserve"> </w:t>
+      </w:r>
+      <w:r>
+        <w:t xml:space="preserve">There is no such evidentiary record here, and there is significant dispute about whether the technical deficiencies identified by Judge Griffin actually occurred or are the result of administrative errors. If Judge Griffin’s protests are to be considered on their merits, such disputes must be resolved through adducing and testing an evidentiary record which does not exist here.</w:t>
+      </w:r>
+    </w:p>
+    <w:p>
+      <w:pPr>
+        <w:pStyle w:val="BodyTextNote"/>
+      </w:pPr>
+      <w:r>
+        <w:t xml:space="preserve">Further, there was no argument in</w:t>
+      </w:r>
+      <w:r>
+        <w:t xml:space="preserve"> </w:t>
+      </w:r>
+      <w:r>
+        <w:rPr>
+          <w:i/>
+          <w:iCs/>
+        </w:rPr>
+        <w:t xml:space="preserve">James</w:t>
+      </w:r>
+      <w:r>
+        <w:t xml:space="preserve"> </w:t>
+      </w:r>
+      <w:r>
+        <w:t xml:space="preserve">that voters detrimentally relied on the State Board’s guidance, as the State Board had shifted its interpretation of the relevant North Carolina statutes in</w:t>
+      </w:r>
+      <w:r>
+        <w:t xml:space="preserve"> </w:t>
+      </w:r>
+      <w:r>
+        <w:rPr>
+          <w:i/>
+          <w:iCs/>
+        </w:rPr>
+        <w:t xml:space="preserve">James</w:t>
+      </w:r>
+      <w:r>
+        <w:t xml:space="preserve"> </w:t>
+      </w:r>
+      <w:r>
+        <w:t xml:space="preserve">for the very first time that election cycle, and had not informed voters or candidates of the shift in policy.</w:t>
+      </w:r>
+      <w:r>
+        <w:t xml:space="preserve"> </w:t>
+      </w:r>
+      <w:r>
+        <w:rPr>
+          <w:i/>
+          <w:iCs/>
+        </w:rPr>
+        <w:t xml:space="preserve">Id.</w:t>
+      </w:r>
+      <w:r>
+        <w:t xml:space="preserve"> </w:t>
+      </w:r>
+      <w:r>
+        <w:t xml:space="preserve">at 265 (noting the “absence of any clear statutory or regulatory directive” that out-of-precinct ballots would be counted in 2004).</w:t>
+      </w:r>
+      <w:r>
+        <w:rPr>
+          <w:rStyle w:val="FootnoteReference"/>
+        </w:rPr>
+        <w:footnoteReference w:id="16"/>
+      </w:r>
+      <w:r>
+        <w:t xml:space="preserve"> </w:t>
+      </w:r>
+      <w:r>
+        <w:t xml:space="preserve">That is the opposite of the case here, where the State Board first, announced prominent rules governing each of Griffin’s protests well in advance of the 2024 election and then, operated in compliance with the election rules existing at the time of the election, and where each category of impacted voters cast their ballots in accordance with the State’s announced rules and procedures.</w:t>
+      </w:r>
+      <w:r>
+        <w:t xml:space="preserve"> </w:t>
+      </w:r>
+      <w:r>
+        <w:rPr>
+          <w:i/>
+          <w:iCs/>
+        </w:rPr>
+        <w:t xml:space="preserve">James</w:t>
+      </w:r>
+      <w:r>
+        <w:t xml:space="preserve"> </w:t>
+      </w:r>
+      <w:r>
+        <w:t xml:space="preserve">does not require, or even counsel, granting Griffin’s protests.</w:t>
+      </w:r>
+    </w:p>
+    <w:p>
+      <w:pPr>
+        <w:pStyle w:val="BodyTextNote"/>
+      </w:pPr>
+      <w:r>
+        <w:t xml:space="preserve">Judge Griffin’s contention that “this is not an instance in which an election official affirmatively instructed a voter” to take a specific course of action is wholly inaccurate. Griffin Brief, Case No. 619</w:t>
       </w:r>
       <w:r>
         <w:noBreakHyphen/>
       </w:r>
       <w:r>
-        <w:t xml:space="preserve">182.12, the State Board of Elections took jurisdiction over the protests at issue here.</w:t>
-      </w:r>
-      <w:r>
-        <w:t xml:space="preserve"> </w:t>
-      </w:r>
-      <w:r>
-        <w:rPr>
-          <w:i/>
-          <w:iCs/>
-        </w:rPr>
-        <w:t xml:space="preserve">See</w:t>
-      </w:r>
-      <w:r>
-        <w:t xml:space="preserve"> </w:t>
-      </w:r>
-      <w:r>
-        <w:t xml:space="preserve">NCSBE Decision and Order on Protests at 4. When the State Board of Elections takes jurisdiction of a protest, it follows the normal protest procedures laid out in N.C.G.S. § 163</w:t>
-      </w:r>
-      <w:r>
-        <w:noBreakHyphen/>
-      </w:r>
-      <w:r>
-        <w:t xml:space="preserve">182.10. More importantly, the burden of proof to establish “substantial evidence of any violation, irregularity, or misconduct sufficient to cast doubt on the results of the election” remains in place, as it must for all election protests.</w:t>
-      </w:r>
-      <w:r>
-        <w:t xml:space="preserve"> </w:t>
-      </w:r>
-      <w:r>
-        <w:rPr>
-          <w:i/>
-          <w:iCs/>
-        </w:rPr>
-        <w:t xml:space="preserve">See</w:t>
-      </w:r>
-      <w:r>
-        <w:t xml:space="preserve"> </w:t>
-      </w:r>
-      <w:r>
-        <w:t xml:space="preserve">N.C.G.S. § 163</w:t>
-      </w:r>
-      <w:r>
-        <w:noBreakHyphen/>
-      </w:r>
-      <w:r>
-        <w:t xml:space="preserve">182.10(d)⁠(2). Without such evidence, it is impossible for a protest to succeed.</w:t>
-      </w:r>
-      <w:r>
-        <w:t xml:space="preserve"> </w:t>
-      </w:r>
-      <w:r>
-        <w:rPr>
-          <w:i/>
-          <w:iCs/>
-        </w:rPr>
-        <w:t xml:space="preserve">Id.</w:t>
-      </w:r>
-    </w:p>
-    <w:p>
-      <w:pPr>
-        <w:pStyle w:val="BodyText"/>
-      </w:pPr>
-      <w:r>
-        <w:t xml:space="preserve">Griffin has no such evidence. Not only do his protests not contain any evidence, let alone substantial evidence, he has neglected to account for or rebut the plausible alternative explanations for the purported technical defects he identifies. And even more fundamentally, he has failed to show that any of the voters he challenges are actually ineligible to vote in North Carolina. These are all allegations that, even if they were sufficient to articulate a valid protest theory, must be tested through evidence, especially where the voters have followed the law and alternative and innocent explanations exist. The lack of evidentiary record in this case necessarily prevents Judge Griffin’s protests from establishing anything by substantial evidence, let alone a violation of state election law. There is no evidentiary basis to prove anything with here.</w:t>
-      </w:r>
-    </w:p>
-    <w:p>
-      <w:pPr>
-        <w:pStyle w:val="BodyText"/>
-      </w:pPr>
-      <w:r>
-        <w:rPr>
-          <w:i/>
-          <w:iCs/>
-        </w:rPr>
-        <w:t xml:space="preserve">James v. Bartlett</w:t>
-      </w:r>
-      <w:r>
-        <w:t xml:space="preserve">, 359 N.C. 260 (2005) does not counsel any differently. In</w:t>
-      </w:r>
-      <w:r>
-        <w:t xml:space="preserve"> </w:t>
-      </w:r>
-      <w:r>
-        <w:rPr>
-          <w:i/>
-          <w:iCs/>
-        </w:rPr>
-        <w:t xml:space="preserve">James</w:t>
-      </w:r>
-      <w:r>
-        <w:t xml:space="preserve">, the North Carolina Supreme Court ruled that when the State Board counted out-of-precinct provisional ballots, it was an outcome-determinative violation of state election law. 359 N.C. at 270. However, the evidentiary record in</w:t>
-      </w:r>
-      <w:r>
-        <w:t xml:space="preserve"> </w:t>
-      </w:r>
-      <w:r>
-        <w:rPr>
-          <w:i/>
-          <w:iCs/>
-        </w:rPr>
-        <w:t xml:space="preserve">James</w:t>
-      </w:r>
-      <w:r>
-        <w:t xml:space="preserve"> </w:t>
-      </w:r>
-      <w:r>
-        <w:t xml:space="preserve">was clear: there was no factual dispute that the challenged voters voted out-of-precinct.</w:t>
-      </w:r>
-      <w:r>
-        <w:t xml:space="preserve"> </w:t>
-      </w:r>
-      <w:r>
-        <w:rPr>
-          <w:i/>
-          <w:iCs/>
-        </w:rPr>
-        <w:t xml:space="preserve">Id.</w:t>
-      </w:r>
-      <w:r>
-        <w:t xml:space="preserve"> </w:t>
-      </w:r>
-      <w:r>
-        <w:t xml:space="preserve">at 263. Instead, the case turned entirely on whether voting out of precinct was legal under state law.</w:t>
-      </w:r>
-      <w:r>
-        <w:t xml:space="preserve"> </w:t>
-      </w:r>
-      <w:r>
-        <w:rPr>
-          <w:i/>
-          <w:iCs/>
-        </w:rPr>
-        <w:t xml:space="preserve">Id.</w:t>
-      </w:r>
-      <w:r>
-        <w:t xml:space="preserve"> </w:t>
-      </w:r>
-      <w:r>
-        <w:t xml:space="preserve">There is no such evidentiary record here, and there is significant dispute about whether the technical deficiencies identified by Judge Griffin actually occurred or are the result of administrative errors. If Judge Griffin’s protests are to be considered on their merits, such disputes must be resolved through adducing and testing an evidentiary record which does not exist here.</w:t>
-      </w:r>
-    </w:p>
-    <w:p>
-      <w:pPr>
-        <w:pStyle w:val="BodyTextNote"/>
-      </w:pPr>
-      <w:r>
-        <w:t xml:space="preserve">Further, there was no argument in</w:t>
-      </w:r>
-      <w:r>
-        <w:t xml:space="preserve"> </w:t>
-      </w:r>
-      <w:r>
-        <w:rPr>
-          <w:i/>
-          <w:iCs/>
-        </w:rPr>
-        <w:t xml:space="preserve">James</w:t>
-      </w:r>
-      <w:r>
-        <w:t xml:space="preserve"> </w:t>
-      </w:r>
-      <w:r>
-        <w:t xml:space="preserve">that voters detrimentally relied on the State Board’s guidance, as the State Board had shifted its interpretation of the relevant North Carolina statutes in</w:t>
-      </w:r>
-      <w:r>
-        <w:t xml:space="preserve"> </w:t>
-      </w:r>
-      <w:r>
-        <w:rPr>
-          <w:i/>
-          <w:iCs/>
-        </w:rPr>
-        <w:t xml:space="preserve">James</w:t>
-      </w:r>
-      <w:r>
-        <w:t xml:space="preserve"> </w:t>
-      </w:r>
-      <w:r>
-        <w:t xml:space="preserve">for the very first time that election cycle, and had not informed voters or candidates of the shift in policy.</w:t>
-      </w:r>
-      <w:r>
-        <w:t xml:space="preserve"> </w:t>
-      </w:r>
-      <w:r>
-        <w:rPr>
-          <w:i/>
-          <w:iCs/>
-        </w:rPr>
-        <w:t xml:space="preserve">Id.</w:t>
-      </w:r>
-      <w:r>
-        <w:t xml:space="preserve"> </w:t>
-      </w:r>
-      <w:r>
-        <w:t xml:space="preserve">at 265 (noting the “absence of any clear statutory or regulatory directive” that out-of-precinct ballots would be counted in 2004).</w:t>
+        <w:t xml:space="preserve">910, at 41.</w:t>
       </w:r>
       <w:r>
         <w:rPr>
           <w:rStyle w:val="FootnoteReference"/>
         </w:rPr>
-        <w:footnoteReference w:id="16"/>
-      </w:r>
-      <w:r>
-        <w:t xml:space="preserve"> </w:t>
-      </w:r>
-      <w:r>
-        <w:t xml:space="preserve">That is the opposite of the case here, where the State Board first, announced prominent rules governing each of Griffin’s protests well in advance of the 2024 election and then, operated in compliance with the election rules existing at the time of the election, and where each category of impacted voters cast their ballots in accordance with the State’s announced rules and procedures.</w:t>
-      </w:r>
-      <w:r>
-        <w:t xml:space="preserve"> </w:t>
-      </w:r>
-      <w:r>
-        <w:rPr>
-          <w:i/>
-          <w:iCs/>
-        </w:rPr>
-        <w:t xml:space="preserve">James</w:t>
-      </w:r>
-      <w:r>
-        <w:t xml:space="preserve"> </w:t>
-      </w:r>
-      <w:r>
-        <w:t xml:space="preserve">does not require, or even counsel, granting Griffin’s protests.</w:t>
-      </w:r>
-    </w:p>
-    <w:p>
-      <w:pPr>
-        <w:pStyle w:val="BodyTextNote"/>
-      </w:pPr>
-      <w:r>
-        <w:t xml:space="preserve">Judge Griffin’s contention that “this is not an instance in which an election official affirmatively instructed a voter” to take a specific course of action is wholly inaccurate. Griffin Brief, Case No. 619</w:t>
-      </w:r>
-      <w:r>
-        <w:noBreakHyphen/>
-      </w:r>
-      <w:r>
-        <w:t xml:space="preserve">910, at 41.</w:t>
-      </w:r>
-      <w:r>
-        <w:rPr>
-          <w:rStyle w:val="FootnoteReference"/>
-        </w:rPr>
         <w:footnoteReference w:id="17"/>
       </w:r>
       <w:r>
@@ -5170,7 +5080,7 @@
         <w:t xml:space="preserve">See Military and Overseas Voting</w:t>
       </w:r>
       <w:r>
-        <w:t xml:space="preserve">, NORTH CAROLINA STATE BOARD OF ELECTIONS, https://www.ncsbe.gov/​voting/​military-and-overseas-voting (last visited Feb. 3, 2025). In the case of the Incomplete voters, the State Board announced a year in advance of the 2024 election that it would not require additional information from anyone already registered to vote.</w:t>
+        <w:t xml:space="preserve">, NORTH CAROLINA STATE BOARD OF ELECTIONS, https://​www.​ncsbe.​gov/​voting/​military-​and-​overseas-​voting (last visited Feb. 3, 2025). In the case of the Incomplete voters, the State Board announced a year in advance of the 2024 election that it would not require additional information from anyone already registered to vote.</w:t>
       </w:r>
       <w:r>
         <w:t xml:space="preserve"> </w:t>
@@ -5184,9 +5094,6 @@
       </w:r>
       <w:r>
         <w:t xml:space="preserve">, N.C. State Bd. of Elections, at 4 (Dec. 6, 2023).</w:t>
-      </w:r>
-      <w:r>
-        <w:t xml:space="preserve"> </w:t>
       </w:r>
       <w:r>
         <w:rPr>
@@ -5469,13 +5376,7 @@
         <w:pStyle w:val="BodyText"/>
       </w:pPr>
       <w:r>
-        <w:t xml:space="preserve">For the reasons stated above, Amici respectfully requests that the Court hold that, in addition to the reasons stated by the NCSBE Decision and Order, Griffin’s protests also fail as a matter of law for failure to allege or prove the challenged voters are actually ineligible to vote in North Carolina, as required by N.C.G.S. § 163</w:t>
-      </w:r>
-      <w:r>
-        <w:noBreakHyphen/>
-      </w:r>
-      <w:r>
-        <w:t xml:space="preserve">90.1.</w:t>
+        <w:t xml:space="preserve">For the reasons stated above, Amici respectfully requests that the Court hold that, in addition to the reasons stated by the NCSBE Decision and Order, Griffin’s protests also fail as a matter of law for failure to allege or prove the challenged voters are actually ineligible to vote in North Carolina, as required by N.C.G.S. § 163-⁠90.1.</w:t>
       </w:r>
     </w:p>
     <w:p>
@@ -6625,7 +6526,7 @@
         <w:t xml:space="preserve"> </w:t>
       </w:r>
       <w:r>
-        <w:t xml:space="preserve">According to an analysis completed by the News and Observer, “Black registered voters were twice as likely to have their votes challenged [by Judge Griffin] as white voters.” “Black NC Voters Twice as Likely to Have Ballots Challenged in Griffin Election Protests,” (Jan. 7, 2025), https://www.newsobserver.com/​news/​politicsgovernment/​election/​article296693744.html. Professor Chris Cooper from Western Carolina University also published an analysis of how the voters on Judge Griffin’s list compared to the entire pool of voters who cast a ballot in the November 2024 election, as well as compared to all active registered voters in North Carolina. Professor Cooper concludes that the challenged voters are “much less likely to be white than the pool of voters in 2024,” and that they are more likely to be either Black, Hispanic or Asian. “An Analysis of Challenged Voters in the 2024 NC Supreme Court Justice Election” (Jan. 12, 2025), https://www.oldnorthstatepolitics.com/2025/01/​an-analysis-of-challengedvoters-in.html.</w:t>
+        <w:t xml:space="preserve">According to an analysis completed by the News and Observer, “Black registered voters were twice as likely to have their votes challenged [by Judge Griffin] as white voters.” “Black NC Voters Twice as Likely to Have Ballots Challenged in Griffin Election Protests,” (Jan. 7, 2025), https://​www.​newsobserver.​com/​news/​politicsgovernment/​election/​article296693744.​html. Professor Chris Cooper from Western Carolina University also published an analysis of how the voters on Judge Griffin’s list compared to the entire pool of voters who cast a ballot in the November 2024 election, as well as compared to all active registered voters in North Carolina. Professor Cooper concludes that the challenged voters are “much less likely to be white than the pool of voters in 2024,” and that they are more likely to be either Black, Hispanic or Asian. “An Analysis of Challenged Voters in the 2024 NC Supreme Court Justice Election” (Jan. 12, 2025), https://​www.​oldnorthstatepolitics.​com/​2025/​01/​an-​analysis-​of-​challengedvoters-​in.​html.</w:t>
       </w:r>
     </w:p>
   </w:footnote>
@@ -6644,7 +6545,7 @@
         <w:t xml:space="preserve"> </w:t>
       </w:r>
       <w:r>
-        <w:t xml:space="preserve">https://s3.amazonaws.com/​dl.ncsbe.gov/​Requests/2020/​Election%20Protest%20Procedures%20Guide.pdf.</w:t>
+        <w:t xml:space="preserve">https://​s3.​amazonaws.​com/​dl.​ncsbe.​gov/​Requests/​2020/​Election%20Protest%20Procedures%20Guide.​pdf.</w:t>
       </w:r>
     </w:p>
   </w:footnote>
@@ -6663,7 +6564,7 @@
         <w:t xml:space="preserve"> </w:t>
       </w:r>
       <w:r>
-        <w:t xml:space="preserve">https://s3.amazonaws.com/​dl.ncsbe.gov/​Legal/​Voter%20Challenge%20Guide.pdf.</w:t>
+        <w:t xml:space="preserve">https://​s3.​amazonaws.​com/​dl.​ncsbe.​gov/​Legal/​Voter%20Challenge%20Guide.​pdf.</w:t>
       </w:r>
     </w:p>
   </w:footnote>
@@ -6682,13 +6583,13 @@
         <w:t xml:space="preserve"> </w:t>
       </w:r>
       <w:r>
-        <w:t xml:space="preserve">https://www.oah.nc.gov/​minutes-march-meeting</w:t>
+        <w:t xml:space="preserve">https://​www.​oah.​nc.​gov/​minutes-​march-​meeting</w:t>
       </w:r>
       <w:r>
         <w:noBreakHyphen/>
       </w:r>
       <w:r>
-        <w:t xml:space="preserve">2024-signedpdf/​open (8 N.C. Admin. Code § 17.0109 approved unanimously).</w:t>
+        <w:t xml:space="preserve">2024-​signedpdf/​open (8 N.C. Admin. Code § 17.0109 approved unanimously).</w:t>
       </w:r>
     </w:p>
   </w:footnote>
@@ -6777,13 +6678,13 @@
         <w:t xml:space="preserve"> </w:t>
       </w:r>
       <w:r>
-        <w:t xml:space="preserve">https://s3.amazonaws.com/​dl.ncsbe.gov/​HAVA%20Administrative%20Complaints/2023</w:t>
+        <w:t xml:space="preserve">https://​s3.​amazonaws.​com/​dl.​ncsbe.​gov/​HAVA%20Administrative%20Complaints/​2023</w:t>
       </w:r>
       <w:r>
         <w:noBreakHyphen/>
       </w:r>
       <w:r>
-        <w:t xml:space="preserve">1006%20Snow/​NCSBE%20HAVA%20Complaint%20Decision%20-%20Snow.pdf.</w:t>
+        <w:t xml:space="preserve">1006%20Snow/​NCSBE%20HAVA%20Complaint%20Decision%20-%20Snow.​pdf.</w:t>
       </w:r>
     </w:p>
   </w:footnote>
@@ -6815,7 +6716,7 @@
         <w:t xml:space="preserve">See People ex rel. Boyer v. Teague</w:t>
       </w:r>
       <w:r>
-        <w:t xml:space="preserve">, 106 N.C. 576, 11 S.E. 665, 670 (1890) (rejecting effort to disqualify vote based on an alleged failure to register where “the voter procure[d] the proper certificate and duly register[ed] thereunder[,]” since where “the registrar made a mistake, without the fault or complicity of the voter . . . the vote is legal and should not be disturbed”).</w:t>
+        <w:t xml:space="preserve">, 106 N.C. 576, 11 S.E. 665, 670 (1890) (rejecting effort to disqualify vote based on an alleged failure to register where “the voter procure[d] the proper certificate and duly register[ed] thereunder[,]” since where “the registrar made a mistake, without the fault or complicity of the voter . . . the vote is legal and should not be disturbed”).</w:t>
       </w:r>
       <w:r>
         <w:t xml:space="preserve"> </w:t>
@@ -6828,7 +6729,7 @@
         <w:t xml:space="preserve">See also Woodall v. W. Wake Highway Com.</w:t>
       </w:r>
       <w:r>
-        <w:t xml:space="preserve">, 176 N.C. 377, 388–91 , 97 S.E. 226, 231–32 (1918);</w:t>
+        <w:t xml:space="preserve">, 176 N.C. 377, 388–91 , 97 S.E. 226, 231–32 (1918);</w:t>
       </w:r>
       <w:r>
         <w:t xml:space="preserve"> </w:t>
@@ -6873,7 +6774,7 @@
         <w:t xml:space="preserve">To gain a court seat, Republicans seek to throw out thousands of votes</w:t>
       </w:r>
       <w:r>
-        <w:t xml:space="preserve">, WASH. POST (Jan. 23, 2025), https://www.washingtonpost.com/​politics/2025/01/23/​north-carolina-supreme-court-griffin-riggs/. Likewise, Spring Dawson-McClure of Orange County verified that her 2012 voter registration contained her Social Security Number and was told by her County Board of Election that she likely was flagged for the challenge list because her Social Security Number matches her maiden name, and not her married name. Joe Bruno,</w:t>
+        <w:t xml:space="preserve">, WASH. POST (Jan. 23, 2025), https://​www.​washingtonpost.​com/​politics/​2025/​01/​23/​north-​carolina-​supreme-​court-​griffin-​riggs/​. Likewise, Spring Dawson-McClure of Orange County verified that her 2012 voter registration contained her Social Security Number and was told by her County Board of Election that she likely was flagged for the challenge list because her Social Security Number matches her maiden name, and not her married name. Joe Bruno,</w:t>
       </w:r>
       <w:r>
         <w:t xml:space="preserve"> </w:t>
@@ -6886,13 +6787,13 @@
         <w:t xml:space="preserve">Voter whose ballot is being challenged provided SSN during registration</w:t>
       </w:r>
       <w:r>
-        <w:t xml:space="preserve">, YAHOONEWS (Jan. 8, 2025), https://www.yahoo.com/​news/​voter-whose-ballot-being-challenged</w:t>
+        <w:t xml:space="preserve">, YAHOONEWS (Jan. 8, 2025), https://​www.​yahoo.​com/​news/​voter-​whose-​ballot-​being-​challenged</w:t>
       </w:r>
       <w:r>
         <w:noBreakHyphen/>
       </w:r>
       <w:r>
-        <w:t xml:space="preserve">215500041.html?guccounter=1.</w:t>
+        <w:t xml:space="preserve">215500041.​html?​guccounter=1.</w:t>
       </w:r>
     </w:p>
   </w:footnote>
@@ -6911,7 +6812,7 @@
         <w:t xml:space="preserve"> </w:t>
       </w:r>
       <w:r>
-        <w:t xml:space="preserve">https://www.propublica.org/​article/​north-carolina-voters-jefferson-griffin-supreme-court-challenge.</w:t>
+        <w:t xml:space="preserve">https://​www.​propublica.​org/​article/​north-​carolina-​voters-​jefferson-​griffin-​supreme-​court-​challenge.</w:t>
       </w:r>
     </w:p>
   </w:footnote>
@@ -7653,6 +7554,7 @@
     <w:unhideWhenUsed/>
     <w:qFormat/>
     <w:pPr>
+      <w:keepLines/>
       <w:spacing w:before="0" w:after="140" w:line="276" w:lineRule="exact"/>
     </w:pPr>
     <w:rPr>
@@ -7903,6 +7805,33 @@
     <w:pPr>
       <w:spacing w:before="0" w:after="0" w:line="276" w:lineRule="exact"/>
       <w:ind w:left="2160" w:hanging="720"/>
+    </w:pPr>
+  </w:style>
+  <w:style w:type="paragraph" w:customStyle="1" w:styleId="XdQuoteList1">
+    <w:name w:val="Xd Quote List 1"/>
+    <w:basedOn w:val="Normal"/>
+    <w:qFormat/>
+    <w:pPr>
+      <w:spacing w:before="0" w:after="0" w:line="276" w:lineRule="exact"/>
+      <w:ind w:left="1440" w:right="720" w:hanging="720"/>
+    </w:pPr>
+  </w:style>
+  <w:style w:type="paragraph" w:customStyle="1" w:styleId="XdQuoteList2">
+    <w:name w:val="Xd Quote List 2"/>
+    <w:basedOn w:val="Normal"/>
+    <w:qFormat/>
+    <w:pPr>
+      <w:spacing w:before="0" w:after="0" w:line="276" w:lineRule="exact"/>
+      <w:ind w:left="2160" w:right="720" w:hanging="720"/>
+    </w:pPr>
+  </w:style>
+  <w:style w:type="paragraph" w:customStyle="1" w:styleId="XdQuoteList3">
+    <w:name w:val="Xd Quote List 3"/>
+    <w:basedOn w:val="Normal"/>
+    <w:qFormat/>
+    <w:pPr>
+      <w:spacing w:before="0" w:after="0" w:line="276" w:lineRule="exact"/>
+      <w:ind w:left="2880" w:right="720" w:hanging="720"/>
     </w:pPr>
   </w:style>
   <w:style w:type="paragraph" w:customStyle="1" w:styleId="SourceCode">

</xml_diff>